<commit_message>
Upgrade Qsys modules to v4.7.0
Upgrade all Qsys modules from v4.6.1 to v4.7.0 with binary updates. Reorganize Pots Controller and Softphone Controller files between Module and SIMPL directories. Add dial string input support to Pots Controller module with DialStringIn parameter and NumString callback handler. Update help documentation.
</commit_message>
<xml_diff>
--- a/SIMPL/Qsys Core Help File.docx
+++ b/SIMPL/Qsys Core Help File.docx
@@ -1,6 +1,6 @@
 
 <file path=word/document.xml><?xml version="1.0" encoding="utf-8"?>
-<w:document xmlns:wpc="http://schemas.microsoft.com/office/word/2010/wordprocessingCanvas" xmlns:cx="http://schemas.microsoft.com/office/drawing/2014/chartex" xmlns:cx1="http://schemas.microsoft.com/office/drawing/2015/9/8/chartex" xmlns:cx2="http://schemas.microsoft.com/office/drawing/2015/10/21/chartex" xmlns:cx3="http://schemas.microsoft.com/office/drawing/2016/5/9/chartex" xmlns:cx4="http://schemas.microsoft.com/office/drawing/2016/5/10/chartex" xmlns:cx5="http://schemas.microsoft.com/office/drawing/2016/5/11/chartex" xmlns:cx6="http://schemas.microsoft.com/office/drawing/2016/5/12/chartex" xmlns:cx7="http://schemas.microsoft.com/office/drawing/2016/5/13/chartex" xmlns:cx8="http://schemas.microsoft.com/office/drawing/2016/5/14/chartex" xmlns:mc="http://schemas.openxmlformats.org/markup-compatibility/2006" xmlns:aink="http://schemas.microsoft.com/office/drawing/2016/ink" xmlns:am3d="http://schemas.microsoft.com/office/drawing/2017/model3d" xmlns:o="urn:schemas-microsoft-com:office:office" xmlns:oel="http://schemas.microsoft.com/office/2019/extlst" xmlns:r="http://schemas.openxmlformats.org/officeDocument/2006/relationships" xmlns:m="http://schemas.openxmlformats.org/officeDocument/2006/math" xmlns:v="urn:schemas-microsoft-com:vml" xmlns:wp14="http://schemas.microsoft.com/office/word/2010/wordprocessingDrawing" xmlns:wp="http://schemas.openxmlformats.org/drawingml/2006/wordprocessingDrawing" xmlns:w10="urn:schemas-microsoft-com:office:word" xmlns:w="http://schemas.openxmlformats.org/wordprocessingml/2006/main" xmlns:w14="http://schemas.microsoft.com/office/word/2010/wordml" xmlns:w15="http://schemas.microsoft.com/office/word/2012/wordml" xmlns:w16cei="http://schemas.microsoft.com/office/word/2026/wordml/cei" xmlns:w16cex="http://schemas.microsoft.com/office/word/2018/wordml/cex" xmlns:w16cid="http://schemas.microsoft.com/office/word/2016/wordml/cid" xmlns:w16="http://schemas.microsoft.com/office/word/2018/wordml" xmlns:w16du="http://schemas.microsoft.com/office/word/2023/wordml/word16du" xmlns:w16sdtdh="http://schemas.microsoft.com/office/word/2020/wordml/sdtdatahash" xmlns:w16sdtfl="http://schemas.microsoft.com/office/word/2024/wordml/sdtformatlock" xmlns:w16se="http://schemas.microsoft.com/office/word/2015/wordml/symex" xmlns:wpg="http://schemas.microsoft.com/office/word/2010/wordprocessingGroup" xmlns:wpi="http://schemas.microsoft.com/office/word/2010/wordprocessingInk" xmlns:wne="http://schemas.microsoft.com/office/word/2006/wordml" xmlns:wps="http://schemas.microsoft.com/office/word/2010/wordprocessingShape" mc:Ignorable="w14 w15 w16se w16cid w16 w16cex w16sdtdh w16sdtfl w16du wp14">
+<w:document xmlns:wpc="http://schemas.microsoft.com/office/word/2010/wordprocessingCanvas" xmlns:cx="http://schemas.microsoft.com/office/drawing/2014/chartex" xmlns:cx1="http://schemas.microsoft.com/office/drawing/2015/9/8/chartex" xmlns:cx2="http://schemas.microsoft.com/office/drawing/2015/10/21/chartex" xmlns:cx3="http://schemas.microsoft.com/office/drawing/2016/5/9/chartex" xmlns:cx4="http://schemas.microsoft.com/office/drawing/2016/5/10/chartex" xmlns:cx5="http://schemas.microsoft.com/office/drawing/2016/5/11/chartex" xmlns:cx6="http://schemas.microsoft.com/office/drawing/2016/5/12/chartex" xmlns:cx7="http://schemas.microsoft.com/office/drawing/2016/5/13/chartex" xmlns:cx8="http://schemas.microsoft.com/office/drawing/2016/5/14/chartex" xmlns:mc="http://schemas.openxmlformats.org/markup-compatibility/2006" xmlns:aink="http://schemas.microsoft.com/office/drawing/2016/ink" xmlns:am3d="http://schemas.microsoft.com/office/drawing/2017/model3d" xmlns:o="urn:schemas-microsoft-com:office:office" xmlns:oel="http://schemas.microsoft.com/office/2019/extlst" xmlns:r="http://schemas.openxmlformats.org/officeDocument/2006/relationships" xmlns:m="http://schemas.openxmlformats.org/officeDocument/2006/math" xmlns:v="urn:schemas-microsoft-com:vml" xmlns:wp14="http://schemas.microsoft.com/office/word/2010/wordprocessingDrawing" xmlns:wp="http://schemas.openxmlformats.org/drawingml/2006/wordprocessingDrawing" xmlns:w10="urn:schemas-microsoft-com:office:word" xmlns:w="http://schemas.openxmlformats.org/wordprocessingml/2006/main" xmlns:w14="http://schemas.microsoft.com/office/word/2010/wordml" xmlns:w15="http://schemas.microsoft.com/office/word/2012/wordml" xmlns:w16cex="http://schemas.microsoft.com/office/word/2018/wordml/cex" xmlns:w16cid="http://schemas.microsoft.com/office/word/2016/wordml/cid" xmlns:w16="http://schemas.microsoft.com/office/word/2018/wordml" xmlns:w16du="http://schemas.microsoft.com/office/word/2023/wordml/word16du" xmlns:w16sdtdh="http://schemas.microsoft.com/office/word/2020/wordml/sdtdatahash" xmlns:w16sdtfl="http://schemas.microsoft.com/office/word/2024/wordml/sdtformatlock" xmlns:w16se="http://schemas.microsoft.com/office/word/2015/wordml/symex" xmlns:wpg="http://schemas.microsoft.com/office/word/2010/wordprocessingGroup" xmlns:wpi="http://schemas.microsoft.com/office/word/2010/wordprocessingInk" xmlns:wne="http://schemas.microsoft.com/office/word/2006/wordml" xmlns:wps="http://schemas.microsoft.com/office/word/2010/wordprocessingShape" mc:Ignorable="w14 w15 w16se w16cid w16 w16cex w16sdtdh w16sdtfl w16du wp14">
   <w:body>
     <w:tbl>
       <w:tblPr>
@@ -260,25 +260,7 @@
                 <w:sz w:val="15"/>
                 <w:szCs w:val="24"/>
               </w:rPr>
-              <w:t>6</w:t>
-            </w:r>
-            <w:r>
-              <w:rPr>
-                <w:rFonts w:ascii="Verdana" w:hAnsi="Verdana"/>
-                <w:color w:val="000000"/>
-                <w:sz w:val="15"/>
-                <w:szCs w:val="24"/>
-              </w:rPr>
-              <w:t>.</w:t>
-            </w:r>
-            <w:r>
-              <w:rPr>
-                <w:rFonts w:ascii="Verdana" w:hAnsi="Verdana"/>
-                <w:color w:val="000000"/>
-                <w:sz w:val="15"/>
-                <w:szCs w:val="24"/>
-              </w:rPr>
-              <w:t>1</w:t>
+              <w:t>7.0</w:t>
             </w:r>
           </w:p>
         </w:tc>
@@ -3024,7 +3006,7 @@
 </file>
 
 <file path=word/endnotes.xml><?xml version="1.0" encoding="utf-8"?>
-<w:endnotes xmlns:wpc="http://schemas.microsoft.com/office/word/2010/wordprocessingCanvas" xmlns:cx="http://schemas.microsoft.com/office/drawing/2014/chartex" xmlns:cx1="http://schemas.microsoft.com/office/drawing/2015/9/8/chartex" xmlns:cx2="http://schemas.microsoft.com/office/drawing/2015/10/21/chartex" xmlns:cx3="http://schemas.microsoft.com/office/drawing/2016/5/9/chartex" xmlns:cx4="http://schemas.microsoft.com/office/drawing/2016/5/10/chartex" xmlns:cx5="http://schemas.microsoft.com/office/drawing/2016/5/11/chartex" xmlns:cx6="http://schemas.microsoft.com/office/drawing/2016/5/12/chartex" xmlns:cx7="http://schemas.microsoft.com/office/drawing/2016/5/13/chartex" xmlns:cx8="http://schemas.microsoft.com/office/drawing/2016/5/14/chartex" xmlns:mc="http://schemas.openxmlformats.org/markup-compatibility/2006" xmlns:aink="http://schemas.microsoft.com/office/drawing/2016/ink" xmlns:am3d="http://schemas.microsoft.com/office/drawing/2017/model3d" xmlns:o="urn:schemas-microsoft-com:office:office" xmlns:oel="http://schemas.microsoft.com/office/2019/extlst" xmlns:r="http://schemas.openxmlformats.org/officeDocument/2006/relationships" xmlns:m="http://schemas.openxmlformats.org/officeDocument/2006/math" xmlns:v="urn:schemas-microsoft-com:vml" xmlns:wp14="http://schemas.microsoft.com/office/word/2010/wordprocessingDrawing" xmlns:wp="http://schemas.openxmlformats.org/drawingml/2006/wordprocessingDrawing" xmlns:w10="urn:schemas-microsoft-com:office:word" xmlns:w="http://schemas.openxmlformats.org/wordprocessingml/2006/main" xmlns:w14="http://schemas.microsoft.com/office/word/2010/wordml" xmlns:w15="http://schemas.microsoft.com/office/word/2012/wordml" xmlns:w16cei="http://schemas.microsoft.com/office/word/2026/wordml/cei" xmlns:w16cex="http://schemas.microsoft.com/office/word/2018/wordml/cex" xmlns:w16cid="http://schemas.microsoft.com/office/word/2016/wordml/cid" xmlns:w16="http://schemas.microsoft.com/office/word/2018/wordml" xmlns:w16du="http://schemas.microsoft.com/office/word/2023/wordml/word16du" xmlns:w16sdtdh="http://schemas.microsoft.com/office/word/2020/wordml/sdtdatahash" xmlns:w16sdtfl="http://schemas.microsoft.com/office/word/2024/wordml/sdtformatlock" xmlns:w16se="http://schemas.microsoft.com/office/word/2015/wordml/symex" xmlns:wpg="http://schemas.microsoft.com/office/word/2010/wordprocessingGroup" xmlns:wpi="http://schemas.microsoft.com/office/word/2010/wordprocessingInk" xmlns:wne="http://schemas.microsoft.com/office/word/2006/wordml" xmlns:wps="http://schemas.microsoft.com/office/word/2010/wordprocessingShape" mc:Ignorable="w14 w15 w16se w16cid w16 w16cex w16sdtdh w16sdtfl w16du wp14">
+<w:endnotes xmlns:wpc="http://schemas.microsoft.com/office/word/2010/wordprocessingCanvas" xmlns:cx="http://schemas.microsoft.com/office/drawing/2014/chartex" xmlns:cx1="http://schemas.microsoft.com/office/drawing/2015/9/8/chartex" xmlns:cx2="http://schemas.microsoft.com/office/drawing/2015/10/21/chartex" xmlns:cx3="http://schemas.microsoft.com/office/drawing/2016/5/9/chartex" xmlns:cx4="http://schemas.microsoft.com/office/drawing/2016/5/10/chartex" xmlns:cx5="http://schemas.microsoft.com/office/drawing/2016/5/11/chartex" xmlns:cx6="http://schemas.microsoft.com/office/drawing/2016/5/12/chartex" xmlns:cx7="http://schemas.microsoft.com/office/drawing/2016/5/13/chartex" xmlns:cx8="http://schemas.microsoft.com/office/drawing/2016/5/14/chartex" xmlns:mc="http://schemas.openxmlformats.org/markup-compatibility/2006" xmlns:aink="http://schemas.microsoft.com/office/drawing/2016/ink" xmlns:am3d="http://schemas.microsoft.com/office/drawing/2017/model3d" xmlns:o="urn:schemas-microsoft-com:office:office" xmlns:oel="http://schemas.microsoft.com/office/2019/extlst" xmlns:r="http://schemas.openxmlformats.org/officeDocument/2006/relationships" xmlns:m="http://schemas.openxmlformats.org/officeDocument/2006/math" xmlns:v="urn:schemas-microsoft-com:vml" xmlns:wp14="http://schemas.microsoft.com/office/word/2010/wordprocessingDrawing" xmlns:wp="http://schemas.openxmlformats.org/drawingml/2006/wordprocessingDrawing" xmlns:w10="urn:schemas-microsoft-com:office:word" xmlns:w="http://schemas.openxmlformats.org/wordprocessingml/2006/main" xmlns:w14="http://schemas.microsoft.com/office/word/2010/wordml" xmlns:w15="http://schemas.microsoft.com/office/word/2012/wordml" xmlns:w16cex="http://schemas.microsoft.com/office/word/2018/wordml/cex" xmlns:w16cid="http://schemas.microsoft.com/office/word/2016/wordml/cid" xmlns:w16="http://schemas.microsoft.com/office/word/2018/wordml" xmlns:w16du="http://schemas.microsoft.com/office/word/2023/wordml/word16du" xmlns:w16sdtdh="http://schemas.microsoft.com/office/word/2020/wordml/sdtdatahash" xmlns:w16sdtfl="http://schemas.microsoft.com/office/word/2024/wordml/sdtformatlock" xmlns:w16se="http://schemas.microsoft.com/office/word/2015/wordml/symex" xmlns:wpg="http://schemas.microsoft.com/office/word/2010/wordprocessingGroup" xmlns:wpi="http://schemas.microsoft.com/office/word/2010/wordprocessingInk" xmlns:wne="http://schemas.microsoft.com/office/word/2006/wordml" xmlns:wps="http://schemas.microsoft.com/office/word/2010/wordprocessingShape" mc:Ignorable="w14 w15 w16se w16cid w16 w16cex w16sdtdh w16sdtfl w16du wp14">
   <w:endnote w:type="separator" w:id="-1">
     <w:p>
       <w:r>
@@ -3043,7 +3025,7 @@
 </file>
 
 <file path=word/footer1.xml><?xml version="1.0" encoding="utf-8"?>
-<w:ftr xmlns:wpc="http://schemas.microsoft.com/office/word/2010/wordprocessingCanvas" xmlns:cx="http://schemas.microsoft.com/office/drawing/2014/chartex" xmlns:cx1="http://schemas.microsoft.com/office/drawing/2015/9/8/chartex" xmlns:cx2="http://schemas.microsoft.com/office/drawing/2015/10/21/chartex" xmlns:cx3="http://schemas.microsoft.com/office/drawing/2016/5/9/chartex" xmlns:cx4="http://schemas.microsoft.com/office/drawing/2016/5/10/chartex" xmlns:cx5="http://schemas.microsoft.com/office/drawing/2016/5/11/chartex" xmlns:cx6="http://schemas.microsoft.com/office/drawing/2016/5/12/chartex" xmlns:cx7="http://schemas.microsoft.com/office/drawing/2016/5/13/chartex" xmlns:cx8="http://schemas.microsoft.com/office/drawing/2016/5/14/chartex" xmlns:mc="http://schemas.openxmlformats.org/markup-compatibility/2006" xmlns:aink="http://schemas.microsoft.com/office/drawing/2016/ink" xmlns:am3d="http://schemas.microsoft.com/office/drawing/2017/model3d" xmlns:o="urn:schemas-microsoft-com:office:office" xmlns:oel="http://schemas.microsoft.com/office/2019/extlst" xmlns:r="http://schemas.openxmlformats.org/officeDocument/2006/relationships" xmlns:m="http://schemas.openxmlformats.org/officeDocument/2006/math" xmlns:v="urn:schemas-microsoft-com:vml" xmlns:wp14="http://schemas.microsoft.com/office/word/2010/wordprocessingDrawing" xmlns:wp="http://schemas.openxmlformats.org/drawingml/2006/wordprocessingDrawing" xmlns:w10="urn:schemas-microsoft-com:office:word" xmlns:w="http://schemas.openxmlformats.org/wordprocessingml/2006/main" xmlns:w14="http://schemas.microsoft.com/office/word/2010/wordml" xmlns:w15="http://schemas.microsoft.com/office/word/2012/wordml" xmlns:w16cei="http://schemas.microsoft.com/office/word/2026/wordml/cei" xmlns:w16cex="http://schemas.microsoft.com/office/word/2018/wordml/cex" xmlns:w16cid="http://schemas.microsoft.com/office/word/2016/wordml/cid" xmlns:w16="http://schemas.microsoft.com/office/word/2018/wordml" xmlns:w16du="http://schemas.microsoft.com/office/word/2023/wordml/word16du" xmlns:w16sdtdh="http://schemas.microsoft.com/office/word/2020/wordml/sdtdatahash" xmlns:w16sdtfl="http://schemas.microsoft.com/office/word/2024/wordml/sdtformatlock" xmlns:w16se="http://schemas.microsoft.com/office/word/2015/wordml/symex" xmlns:wpg="http://schemas.microsoft.com/office/word/2010/wordprocessingGroup" xmlns:wpi="http://schemas.microsoft.com/office/word/2010/wordprocessingInk" xmlns:wne="http://schemas.microsoft.com/office/word/2006/wordml" xmlns:wps="http://schemas.microsoft.com/office/word/2010/wordprocessingShape" mc:Ignorable="w14 w15 w16se w16cid w16 w16cex w16sdtdh w16sdtfl w16du wp14">
+<w:ftr xmlns:wpc="http://schemas.microsoft.com/office/word/2010/wordprocessingCanvas" xmlns:cx="http://schemas.microsoft.com/office/drawing/2014/chartex" xmlns:cx1="http://schemas.microsoft.com/office/drawing/2015/9/8/chartex" xmlns:cx2="http://schemas.microsoft.com/office/drawing/2015/10/21/chartex" xmlns:cx3="http://schemas.microsoft.com/office/drawing/2016/5/9/chartex" xmlns:cx4="http://schemas.microsoft.com/office/drawing/2016/5/10/chartex" xmlns:cx5="http://schemas.microsoft.com/office/drawing/2016/5/11/chartex" xmlns:cx6="http://schemas.microsoft.com/office/drawing/2016/5/12/chartex" xmlns:cx7="http://schemas.microsoft.com/office/drawing/2016/5/13/chartex" xmlns:cx8="http://schemas.microsoft.com/office/drawing/2016/5/14/chartex" xmlns:mc="http://schemas.openxmlformats.org/markup-compatibility/2006" xmlns:aink="http://schemas.microsoft.com/office/drawing/2016/ink" xmlns:am3d="http://schemas.microsoft.com/office/drawing/2017/model3d" xmlns:o="urn:schemas-microsoft-com:office:office" xmlns:oel="http://schemas.microsoft.com/office/2019/extlst" xmlns:r="http://schemas.openxmlformats.org/officeDocument/2006/relationships" xmlns:m="http://schemas.openxmlformats.org/officeDocument/2006/math" xmlns:v="urn:schemas-microsoft-com:vml" xmlns:wp14="http://schemas.microsoft.com/office/word/2010/wordprocessingDrawing" xmlns:wp="http://schemas.openxmlformats.org/drawingml/2006/wordprocessingDrawing" xmlns:w10="urn:schemas-microsoft-com:office:word" xmlns:w="http://schemas.openxmlformats.org/wordprocessingml/2006/main" xmlns:w14="http://schemas.microsoft.com/office/word/2010/wordml" xmlns:w15="http://schemas.microsoft.com/office/word/2012/wordml" xmlns:w16cex="http://schemas.microsoft.com/office/word/2018/wordml/cex" xmlns:w16cid="http://schemas.microsoft.com/office/word/2016/wordml/cid" xmlns:w16="http://schemas.microsoft.com/office/word/2018/wordml" xmlns:w16du="http://schemas.microsoft.com/office/word/2023/wordml/word16du" xmlns:w16sdtdh="http://schemas.microsoft.com/office/word/2020/wordml/sdtdatahash" xmlns:w16sdtfl="http://schemas.microsoft.com/office/word/2024/wordml/sdtformatlock" xmlns:w16se="http://schemas.microsoft.com/office/word/2015/wordml/symex" xmlns:wpg="http://schemas.microsoft.com/office/word/2010/wordprocessingGroup" xmlns:wpi="http://schemas.microsoft.com/office/word/2010/wordprocessingInk" xmlns:wne="http://schemas.microsoft.com/office/word/2006/wordml" xmlns:wps="http://schemas.microsoft.com/office/word/2010/wordprocessingShape" mc:Ignorable="w14 w15 w16se w16cid w16 w16cex w16sdtdh w16sdtfl w16du wp14">
   <w:p>
     <w:pPr>
       <w:pStyle w:val="Footer"/>
@@ -3053,7 +3035,7 @@
 </file>
 
 <file path=word/footer2.xml><?xml version="1.0" encoding="utf-8"?>
-<w:ftr xmlns:wpc="http://schemas.microsoft.com/office/word/2010/wordprocessingCanvas" xmlns:cx="http://schemas.microsoft.com/office/drawing/2014/chartex" xmlns:cx1="http://schemas.microsoft.com/office/drawing/2015/9/8/chartex" xmlns:cx2="http://schemas.microsoft.com/office/drawing/2015/10/21/chartex" xmlns:cx3="http://schemas.microsoft.com/office/drawing/2016/5/9/chartex" xmlns:cx4="http://schemas.microsoft.com/office/drawing/2016/5/10/chartex" xmlns:cx5="http://schemas.microsoft.com/office/drawing/2016/5/11/chartex" xmlns:cx6="http://schemas.microsoft.com/office/drawing/2016/5/12/chartex" xmlns:cx7="http://schemas.microsoft.com/office/drawing/2016/5/13/chartex" xmlns:cx8="http://schemas.microsoft.com/office/drawing/2016/5/14/chartex" xmlns:mc="http://schemas.openxmlformats.org/markup-compatibility/2006" xmlns:aink="http://schemas.microsoft.com/office/drawing/2016/ink" xmlns:am3d="http://schemas.microsoft.com/office/drawing/2017/model3d" xmlns:o="urn:schemas-microsoft-com:office:office" xmlns:oel="http://schemas.microsoft.com/office/2019/extlst" xmlns:r="http://schemas.openxmlformats.org/officeDocument/2006/relationships" xmlns:m="http://schemas.openxmlformats.org/officeDocument/2006/math" xmlns:v="urn:schemas-microsoft-com:vml" xmlns:wp14="http://schemas.microsoft.com/office/word/2010/wordprocessingDrawing" xmlns:wp="http://schemas.openxmlformats.org/drawingml/2006/wordprocessingDrawing" xmlns:w10="urn:schemas-microsoft-com:office:word" xmlns:w="http://schemas.openxmlformats.org/wordprocessingml/2006/main" xmlns:w14="http://schemas.microsoft.com/office/word/2010/wordml" xmlns:w15="http://schemas.microsoft.com/office/word/2012/wordml" xmlns:w16cei="http://schemas.microsoft.com/office/word/2026/wordml/cei" xmlns:w16cex="http://schemas.microsoft.com/office/word/2018/wordml/cex" xmlns:w16cid="http://schemas.microsoft.com/office/word/2016/wordml/cid" xmlns:w16="http://schemas.microsoft.com/office/word/2018/wordml" xmlns:w16du="http://schemas.microsoft.com/office/word/2023/wordml/word16du" xmlns:w16sdtdh="http://schemas.microsoft.com/office/word/2020/wordml/sdtdatahash" xmlns:w16sdtfl="http://schemas.microsoft.com/office/word/2024/wordml/sdtformatlock" xmlns:w16se="http://schemas.microsoft.com/office/word/2015/wordml/symex" xmlns:wpg="http://schemas.microsoft.com/office/word/2010/wordprocessingGroup" xmlns:wpi="http://schemas.microsoft.com/office/word/2010/wordprocessingInk" xmlns:wne="http://schemas.microsoft.com/office/word/2006/wordml" xmlns:wps="http://schemas.microsoft.com/office/word/2010/wordprocessingShape" mc:Ignorable="w14 w15 w16se w16cid w16 w16cex w16sdtdh w16sdtfl w16du wp14">
+<w:ftr xmlns:wpc="http://schemas.microsoft.com/office/word/2010/wordprocessingCanvas" xmlns:cx="http://schemas.microsoft.com/office/drawing/2014/chartex" xmlns:cx1="http://schemas.microsoft.com/office/drawing/2015/9/8/chartex" xmlns:cx2="http://schemas.microsoft.com/office/drawing/2015/10/21/chartex" xmlns:cx3="http://schemas.microsoft.com/office/drawing/2016/5/9/chartex" xmlns:cx4="http://schemas.microsoft.com/office/drawing/2016/5/10/chartex" xmlns:cx5="http://schemas.microsoft.com/office/drawing/2016/5/11/chartex" xmlns:cx6="http://schemas.microsoft.com/office/drawing/2016/5/12/chartex" xmlns:cx7="http://schemas.microsoft.com/office/drawing/2016/5/13/chartex" xmlns:cx8="http://schemas.microsoft.com/office/drawing/2016/5/14/chartex" xmlns:mc="http://schemas.openxmlformats.org/markup-compatibility/2006" xmlns:aink="http://schemas.microsoft.com/office/drawing/2016/ink" xmlns:am3d="http://schemas.microsoft.com/office/drawing/2017/model3d" xmlns:o="urn:schemas-microsoft-com:office:office" xmlns:oel="http://schemas.microsoft.com/office/2019/extlst" xmlns:r="http://schemas.openxmlformats.org/officeDocument/2006/relationships" xmlns:m="http://schemas.openxmlformats.org/officeDocument/2006/math" xmlns:v="urn:schemas-microsoft-com:vml" xmlns:wp14="http://schemas.microsoft.com/office/word/2010/wordprocessingDrawing" xmlns:wp="http://schemas.openxmlformats.org/drawingml/2006/wordprocessingDrawing" xmlns:w10="urn:schemas-microsoft-com:office:word" xmlns:w="http://schemas.openxmlformats.org/wordprocessingml/2006/main" xmlns:w14="http://schemas.microsoft.com/office/word/2010/wordml" xmlns:w15="http://schemas.microsoft.com/office/word/2012/wordml" xmlns:w16cex="http://schemas.microsoft.com/office/word/2018/wordml/cex" xmlns:w16cid="http://schemas.microsoft.com/office/word/2016/wordml/cid" xmlns:w16="http://schemas.microsoft.com/office/word/2018/wordml" xmlns:w16du="http://schemas.microsoft.com/office/word/2023/wordml/word16du" xmlns:w16sdtdh="http://schemas.microsoft.com/office/word/2020/wordml/sdtdatahash" xmlns:w16sdtfl="http://schemas.microsoft.com/office/word/2024/wordml/sdtformatlock" xmlns:w16se="http://schemas.microsoft.com/office/word/2015/wordml/symex" xmlns:wpg="http://schemas.microsoft.com/office/word/2010/wordprocessingGroup" xmlns:wpi="http://schemas.microsoft.com/office/word/2010/wordprocessingInk" xmlns:wne="http://schemas.microsoft.com/office/word/2006/wordml" xmlns:wps="http://schemas.microsoft.com/office/word/2010/wordprocessingShape" mc:Ignorable="w14 w15 w16se w16cid w16 w16cex w16sdtdh w16sdtfl w16du wp14">
   <w:p>
     <w:pPr>
       <w:tabs>
@@ -3072,7 +3054,7 @@
 </file>
 
 <file path=word/footer3.xml><?xml version="1.0" encoding="utf-8"?>
-<w:ftr xmlns:wpc="http://schemas.microsoft.com/office/word/2010/wordprocessingCanvas" xmlns:cx="http://schemas.microsoft.com/office/drawing/2014/chartex" xmlns:cx1="http://schemas.microsoft.com/office/drawing/2015/9/8/chartex" xmlns:cx2="http://schemas.microsoft.com/office/drawing/2015/10/21/chartex" xmlns:cx3="http://schemas.microsoft.com/office/drawing/2016/5/9/chartex" xmlns:cx4="http://schemas.microsoft.com/office/drawing/2016/5/10/chartex" xmlns:cx5="http://schemas.microsoft.com/office/drawing/2016/5/11/chartex" xmlns:cx6="http://schemas.microsoft.com/office/drawing/2016/5/12/chartex" xmlns:cx7="http://schemas.microsoft.com/office/drawing/2016/5/13/chartex" xmlns:cx8="http://schemas.microsoft.com/office/drawing/2016/5/14/chartex" xmlns:mc="http://schemas.openxmlformats.org/markup-compatibility/2006" xmlns:aink="http://schemas.microsoft.com/office/drawing/2016/ink" xmlns:am3d="http://schemas.microsoft.com/office/drawing/2017/model3d" xmlns:o="urn:schemas-microsoft-com:office:office" xmlns:oel="http://schemas.microsoft.com/office/2019/extlst" xmlns:r="http://schemas.openxmlformats.org/officeDocument/2006/relationships" xmlns:m="http://schemas.openxmlformats.org/officeDocument/2006/math" xmlns:v="urn:schemas-microsoft-com:vml" xmlns:wp14="http://schemas.microsoft.com/office/word/2010/wordprocessingDrawing" xmlns:wp="http://schemas.openxmlformats.org/drawingml/2006/wordprocessingDrawing" xmlns:w10="urn:schemas-microsoft-com:office:word" xmlns:w="http://schemas.openxmlformats.org/wordprocessingml/2006/main" xmlns:w14="http://schemas.microsoft.com/office/word/2010/wordml" xmlns:w15="http://schemas.microsoft.com/office/word/2012/wordml" xmlns:w16cei="http://schemas.microsoft.com/office/word/2026/wordml/cei" xmlns:w16cex="http://schemas.microsoft.com/office/word/2018/wordml/cex" xmlns:w16cid="http://schemas.microsoft.com/office/word/2016/wordml/cid" xmlns:w16="http://schemas.microsoft.com/office/word/2018/wordml" xmlns:w16du="http://schemas.microsoft.com/office/word/2023/wordml/word16du" xmlns:w16sdtdh="http://schemas.microsoft.com/office/word/2020/wordml/sdtdatahash" xmlns:w16sdtfl="http://schemas.microsoft.com/office/word/2024/wordml/sdtformatlock" xmlns:w16se="http://schemas.microsoft.com/office/word/2015/wordml/symex" xmlns:wpg="http://schemas.microsoft.com/office/word/2010/wordprocessingGroup" xmlns:wpi="http://schemas.microsoft.com/office/word/2010/wordprocessingInk" xmlns:wne="http://schemas.microsoft.com/office/word/2006/wordml" xmlns:wps="http://schemas.microsoft.com/office/word/2010/wordprocessingShape" mc:Ignorable="w14 w15 w16se w16cid w16 w16cex w16sdtdh w16sdtfl w16du wp14">
+<w:ftr xmlns:wpc="http://schemas.microsoft.com/office/word/2010/wordprocessingCanvas" xmlns:cx="http://schemas.microsoft.com/office/drawing/2014/chartex" xmlns:cx1="http://schemas.microsoft.com/office/drawing/2015/9/8/chartex" xmlns:cx2="http://schemas.microsoft.com/office/drawing/2015/10/21/chartex" xmlns:cx3="http://schemas.microsoft.com/office/drawing/2016/5/9/chartex" xmlns:cx4="http://schemas.microsoft.com/office/drawing/2016/5/10/chartex" xmlns:cx5="http://schemas.microsoft.com/office/drawing/2016/5/11/chartex" xmlns:cx6="http://schemas.microsoft.com/office/drawing/2016/5/12/chartex" xmlns:cx7="http://schemas.microsoft.com/office/drawing/2016/5/13/chartex" xmlns:cx8="http://schemas.microsoft.com/office/drawing/2016/5/14/chartex" xmlns:mc="http://schemas.openxmlformats.org/markup-compatibility/2006" xmlns:aink="http://schemas.microsoft.com/office/drawing/2016/ink" xmlns:am3d="http://schemas.microsoft.com/office/drawing/2017/model3d" xmlns:o="urn:schemas-microsoft-com:office:office" xmlns:oel="http://schemas.microsoft.com/office/2019/extlst" xmlns:r="http://schemas.openxmlformats.org/officeDocument/2006/relationships" xmlns:m="http://schemas.openxmlformats.org/officeDocument/2006/math" xmlns:v="urn:schemas-microsoft-com:vml" xmlns:wp14="http://schemas.microsoft.com/office/word/2010/wordprocessingDrawing" xmlns:wp="http://schemas.openxmlformats.org/drawingml/2006/wordprocessingDrawing" xmlns:w10="urn:schemas-microsoft-com:office:word" xmlns:w="http://schemas.openxmlformats.org/wordprocessingml/2006/main" xmlns:w14="http://schemas.microsoft.com/office/word/2010/wordml" xmlns:w15="http://schemas.microsoft.com/office/word/2012/wordml" xmlns:w16cex="http://schemas.microsoft.com/office/word/2018/wordml/cex" xmlns:w16cid="http://schemas.microsoft.com/office/word/2016/wordml/cid" xmlns:w16="http://schemas.microsoft.com/office/word/2018/wordml" xmlns:w16du="http://schemas.microsoft.com/office/word/2023/wordml/word16du" xmlns:w16sdtdh="http://schemas.microsoft.com/office/word/2020/wordml/sdtdatahash" xmlns:w16sdtfl="http://schemas.microsoft.com/office/word/2024/wordml/sdtformatlock" xmlns:w16se="http://schemas.microsoft.com/office/word/2015/wordml/symex" xmlns:wpg="http://schemas.microsoft.com/office/word/2010/wordprocessingGroup" xmlns:wpi="http://schemas.microsoft.com/office/word/2010/wordprocessingInk" xmlns:wne="http://schemas.microsoft.com/office/word/2006/wordml" xmlns:wps="http://schemas.microsoft.com/office/word/2010/wordprocessingShape" mc:Ignorable="w14 w15 w16se w16cid w16 w16cex w16sdtdh w16sdtfl w16du wp14">
   <w:p>
     <w:pPr>
       <w:pStyle w:val="Footer"/>
@@ -3082,7 +3064,7 @@
 </file>
 
 <file path=word/footnotes.xml><?xml version="1.0" encoding="utf-8"?>
-<w:footnotes xmlns:wpc="http://schemas.microsoft.com/office/word/2010/wordprocessingCanvas" xmlns:cx="http://schemas.microsoft.com/office/drawing/2014/chartex" xmlns:cx1="http://schemas.microsoft.com/office/drawing/2015/9/8/chartex" xmlns:cx2="http://schemas.microsoft.com/office/drawing/2015/10/21/chartex" xmlns:cx3="http://schemas.microsoft.com/office/drawing/2016/5/9/chartex" xmlns:cx4="http://schemas.microsoft.com/office/drawing/2016/5/10/chartex" xmlns:cx5="http://schemas.microsoft.com/office/drawing/2016/5/11/chartex" xmlns:cx6="http://schemas.microsoft.com/office/drawing/2016/5/12/chartex" xmlns:cx7="http://schemas.microsoft.com/office/drawing/2016/5/13/chartex" xmlns:cx8="http://schemas.microsoft.com/office/drawing/2016/5/14/chartex" xmlns:mc="http://schemas.openxmlformats.org/markup-compatibility/2006" xmlns:aink="http://schemas.microsoft.com/office/drawing/2016/ink" xmlns:am3d="http://schemas.microsoft.com/office/drawing/2017/model3d" xmlns:o="urn:schemas-microsoft-com:office:office" xmlns:oel="http://schemas.microsoft.com/office/2019/extlst" xmlns:r="http://schemas.openxmlformats.org/officeDocument/2006/relationships" xmlns:m="http://schemas.openxmlformats.org/officeDocument/2006/math" xmlns:v="urn:schemas-microsoft-com:vml" xmlns:wp14="http://schemas.microsoft.com/office/word/2010/wordprocessingDrawing" xmlns:wp="http://schemas.openxmlformats.org/drawingml/2006/wordprocessingDrawing" xmlns:w10="urn:schemas-microsoft-com:office:word" xmlns:w="http://schemas.openxmlformats.org/wordprocessingml/2006/main" xmlns:w14="http://schemas.microsoft.com/office/word/2010/wordml" xmlns:w15="http://schemas.microsoft.com/office/word/2012/wordml" xmlns:w16cei="http://schemas.microsoft.com/office/word/2026/wordml/cei" xmlns:w16cex="http://schemas.microsoft.com/office/word/2018/wordml/cex" xmlns:w16cid="http://schemas.microsoft.com/office/word/2016/wordml/cid" xmlns:w16="http://schemas.microsoft.com/office/word/2018/wordml" xmlns:w16du="http://schemas.microsoft.com/office/word/2023/wordml/word16du" xmlns:w16sdtdh="http://schemas.microsoft.com/office/word/2020/wordml/sdtdatahash" xmlns:w16sdtfl="http://schemas.microsoft.com/office/word/2024/wordml/sdtformatlock" xmlns:w16se="http://schemas.microsoft.com/office/word/2015/wordml/symex" xmlns:wpg="http://schemas.microsoft.com/office/word/2010/wordprocessingGroup" xmlns:wpi="http://schemas.microsoft.com/office/word/2010/wordprocessingInk" xmlns:wne="http://schemas.microsoft.com/office/word/2006/wordml" xmlns:wps="http://schemas.microsoft.com/office/word/2010/wordprocessingShape" mc:Ignorable="w14 w15 w16se w16cid w16 w16cex w16sdtdh w16sdtfl w16du wp14">
+<w:footnotes xmlns:wpc="http://schemas.microsoft.com/office/word/2010/wordprocessingCanvas" xmlns:cx="http://schemas.microsoft.com/office/drawing/2014/chartex" xmlns:cx1="http://schemas.microsoft.com/office/drawing/2015/9/8/chartex" xmlns:cx2="http://schemas.microsoft.com/office/drawing/2015/10/21/chartex" xmlns:cx3="http://schemas.microsoft.com/office/drawing/2016/5/9/chartex" xmlns:cx4="http://schemas.microsoft.com/office/drawing/2016/5/10/chartex" xmlns:cx5="http://schemas.microsoft.com/office/drawing/2016/5/11/chartex" xmlns:cx6="http://schemas.microsoft.com/office/drawing/2016/5/12/chartex" xmlns:cx7="http://schemas.microsoft.com/office/drawing/2016/5/13/chartex" xmlns:cx8="http://schemas.microsoft.com/office/drawing/2016/5/14/chartex" xmlns:mc="http://schemas.openxmlformats.org/markup-compatibility/2006" xmlns:aink="http://schemas.microsoft.com/office/drawing/2016/ink" xmlns:am3d="http://schemas.microsoft.com/office/drawing/2017/model3d" xmlns:o="urn:schemas-microsoft-com:office:office" xmlns:oel="http://schemas.microsoft.com/office/2019/extlst" xmlns:r="http://schemas.openxmlformats.org/officeDocument/2006/relationships" xmlns:m="http://schemas.openxmlformats.org/officeDocument/2006/math" xmlns:v="urn:schemas-microsoft-com:vml" xmlns:wp14="http://schemas.microsoft.com/office/word/2010/wordprocessingDrawing" xmlns:wp="http://schemas.openxmlformats.org/drawingml/2006/wordprocessingDrawing" xmlns:w10="urn:schemas-microsoft-com:office:word" xmlns:w="http://schemas.openxmlformats.org/wordprocessingml/2006/main" xmlns:w14="http://schemas.microsoft.com/office/word/2010/wordml" xmlns:w15="http://schemas.microsoft.com/office/word/2012/wordml" xmlns:w16cex="http://schemas.microsoft.com/office/word/2018/wordml/cex" xmlns:w16cid="http://schemas.microsoft.com/office/word/2016/wordml/cid" xmlns:w16="http://schemas.microsoft.com/office/word/2018/wordml" xmlns:w16du="http://schemas.microsoft.com/office/word/2023/wordml/word16du" xmlns:w16sdtdh="http://schemas.microsoft.com/office/word/2020/wordml/sdtdatahash" xmlns:w16sdtfl="http://schemas.microsoft.com/office/word/2024/wordml/sdtformatlock" xmlns:w16se="http://schemas.microsoft.com/office/word/2015/wordml/symex" xmlns:wpg="http://schemas.microsoft.com/office/word/2010/wordprocessingGroup" xmlns:wpi="http://schemas.microsoft.com/office/word/2010/wordprocessingInk" xmlns:wne="http://schemas.microsoft.com/office/word/2006/wordml" xmlns:wps="http://schemas.microsoft.com/office/word/2010/wordprocessingShape" mc:Ignorable="w14 w15 w16se w16cid w16 w16cex w16sdtdh w16sdtfl w16du wp14">
   <w:footnote w:type="separator" w:id="-1">
     <w:p>
       <w:r>
@@ -3101,7 +3083,7 @@
 </file>
 
 <file path=word/header1.xml><?xml version="1.0" encoding="utf-8"?>
-<w:hdr xmlns:wpc="http://schemas.microsoft.com/office/word/2010/wordprocessingCanvas" xmlns:cx="http://schemas.microsoft.com/office/drawing/2014/chartex" xmlns:cx1="http://schemas.microsoft.com/office/drawing/2015/9/8/chartex" xmlns:cx2="http://schemas.microsoft.com/office/drawing/2015/10/21/chartex" xmlns:cx3="http://schemas.microsoft.com/office/drawing/2016/5/9/chartex" xmlns:cx4="http://schemas.microsoft.com/office/drawing/2016/5/10/chartex" xmlns:cx5="http://schemas.microsoft.com/office/drawing/2016/5/11/chartex" xmlns:cx6="http://schemas.microsoft.com/office/drawing/2016/5/12/chartex" xmlns:cx7="http://schemas.microsoft.com/office/drawing/2016/5/13/chartex" xmlns:cx8="http://schemas.microsoft.com/office/drawing/2016/5/14/chartex" xmlns:mc="http://schemas.openxmlformats.org/markup-compatibility/2006" xmlns:aink="http://schemas.microsoft.com/office/drawing/2016/ink" xmlns:am3d="http://schemas.microsoft.com/office/drawing/2017/model3d" xmlns:o="urn:schemas-microsoft-com:office:office" xmlns:oel="http://schemas.microsoft.com/office/2019/extlst" xmlns:r="http://schemas.openxmlformats.org/officeDocument/2006/relationships" xmlns:m="http://schemas.openxmlformats.org/officeDocument/2006/math" xmlns:v="urn:schemas-microsoft-com:vml" xmlns:wp14="http://schemas.microsoft.com/office/word/2010/wordprocessingDrawing" xmlns:wp="http://schemas.openxmlformats.org/drawingml/2006/wordprocessingDrawing" xmlns:w10="urn:schemas-microsoft-com:office:word" xmlns:w="http://schemas.openxmlformats.org/wordprocessingml/2006/main" xmlns:w14="http://schemas.microsoft.com/office/word/2010/wordml" xmlns:w15="http://schemas.microsoft.com/office/word/2012/wordml" xmlns:w16cei="http://schemas.microsoft.com/office/word/2026/wordml/cei" xmlns:w16cex="http://schemas.microsoft.com/office/word/2018/wordml/cex" xmlns:w16cid="http://schemas.microsoft.com/office/word/2016/wordml/cid" xmlns:w16="http://schemas.microsoft.com/office/word/2018/wordml" xmlns:w16du="http://schemas.microsoft.com/office/word/2023/wordml/word16du" xmlns:w16sdtdh="http://schemas.microsoft.com/office/word/2020/wordml/sdtdatahash" xmlns:w16sdtfl="http://schemas.microsoft.com/office/word/2024/wordml/sdtformatlock" xmlns:w16se="http://schemas.microsoft.com/office/word/2015/wordml/symex" xmlns:wpg="http://schemas.microsoft.com/office/word/2010/wordprocessingGroup" xmlns:wpi="http://schemas.microsoft.com/office/word/2010/wordprocessingInk" xmlns:wne="http://schemas.microsoft.com/office/word/2006/wordml" xmlns:wps="http://schemas.microsoft.com/office/word/2010/wordprocessingShape" mc:Ignorable="w14 w15 w16se w16cid w16 w16cex w16sdtdh w16sdtfl w16du wp14">
+<w:hdr xmlns:wpc="http://schemas.microsoft.com/office/word/2010/wordprocessingCanvas" xmlns:cx="http://schemas.microsoft.com/office/drawing/2014/chartex" xmlns:cx1="http://schemas.microsoft.com/office/drawing/2015/9/8/chartex" xmlns:cx2="http://schemas.microsoft.com/office/drawing/2015/10/21/chartex" xmlns:cx3="http://schemas.microsoft.com/office/drawing/2016/5/9/chartex" xmlns:cx4="http://schemas.microsoft.com/office/drawing/2016/5/10/chartex" xmlns:cx5="http://schemas.microsoft.com/office/drawing/2016/5/11/chartex" xmlns:cx6="http://schemas.microsoft.com/office/drawing/2016/5/12/chartex" xmlns:cx7="http://schemas.microsoft.com/office/drawing/2016/5/13/chartex" xmlns:cx8="http://schemas.microsoft.com/office/drawing/2016/5/14/chartex" xmlns:mc="http://schemas.openxmlformats.org/markup-compatibility/2006" xmlns:aink="http://schemas.microsoft.com/office/drawing/2016/ink" xmlns:am3d="http://schemas.microsoft.com/office/drawing/2017/model3d" xmlns:o="urn:schemas-microsoft-com:office:office" xmlns:oel="http://schemas.microsoft.com/office/2019/extlst" xmlns:r="http://schemas.openxmlformats.org/officeDocument/2006/relationships" xmlns:m="http://schemas.openxmlformats.org/officeDocument/2006/math" xmlns:v="urn:schemas-microsoft-com:vml" xmlns:wp14="http://schemas.microsoft.com/office/word/2010/wordprocessingDrawing" xmlns:wp="http://schemas.openxmlformats.org/drawingml/2006/wordprocessingDrawing" xmlns:w10="urn:schemas-microsoft-com:office:word" xmlns:w="http://schemas.openxmlformats.org/wordprocessingml/2006/main" xmlns:w14="http://schemas.microsoft.com/office/word/2010/wordml" xmlns:w15="http://schemas.microsoft.com/office/word/2012/wordml" xmlns:w16cex="http://schemas.microsoft.com/office/word/2018/wordml/cex" xmlns:w16cid="http://schemas.microsoft.com/office/word/2016/wordml/cid" xmlns:w16="http://schemas.microsoft.com/office/word/2018/wordml" xmlns:w16du="http://schemas.microsoft.com/office/word/2023/wordml/word16du" xmlns:w16sdtdh="http://schemas.microsoft.com/office/word/2020/wordml/sdtdatahash" xmlns:w16sdtfl="http://schemas.microsoft.com/office/word/2024/wordml/sdtformatlock" xmlns:w16se="http://schemas.microsoft.com/office/word/2015/wordml/symex" xmlns:wpg="http://schemas.microsoft.com/office/word/2010/wordprocessingGroup" xmlns:wpi="http://schemas.microsoft.com/office/word/2010/wordprocessingInk" xmlns:wne="http://schemas.microsoft.com/office/word/2006/wordml" xmlns:wps="http://schemas.microsoft.com/office/word/2010/wordprocessingShape" mc:Ignorable="w14 w15 w16se w16cid w16 w16cex w16sdtdh w16sdtfl w16du wp14">
   <w:p>
     <w:pPr>
       <w:pStyle w:val="Header"/>
@@ -3111,7 +3093,7 @@
 </file>
 
 <file path=word/header2.xml><?xml version="1.0" encoding="utf-8"?>
-<w:hdr xmlns:wpc="http://schemas.microsoft.com/office/word/2010/wordprocessingCanvas" xmlns:cx="http://schemas.microsoft.com/office/drawing/2014/chartex" xmlns:cx1="http://schemas.microsoft.com/office/drawing/2015/9/8/chartex" xmlns:cx2="http://schemas.microsoft.com/office/drawing/2015/10/21/chartex" xmlns:cx3="http://schemas.microsoft.com/office/drawing/2016/5/9/chartex" xmlns:cx4="http://schemas.microsoft.com/office/drawing/2016/5/10/chartex" xmlns:cx5="http://schemas.microsoft.com/office/drawing/2016/5/11/chartex" xmlns:cx6="http://schemas.microsoft.com/office/drawing/2016/5/12/chartex" xmlns:cx7="http://schemas.microsoft.com/office/drawing/2016/5/13/chartex" xmlns:cx8="http://schemas.microsoft.com/office/drawing/2016/5/14/chartex" xmlns:mc="http://schemas.openxmlformats.org/markup-compatibility/2006" xmlns:aink="http://schemas.microsoft.com/office/drawing/2016/ink" xmlns:am3d="http://schemas.microsoft.com/office/drawing/2017/model3d" xmlns:o="urn:schemas-microsoft-com:office:office" xmlns:oel="http://schemas.microsoft.com/office/2019/extlst" xmlns:r="http://schemas.openxmlformats.org/officeDocument/2006/relationships" xmlns:m="http://schemas.openxmlformats.org/officeDocument/2006/math" xmlns:v="urn:schemas-microsoft-com:vml" xmlns:wp14="http://schemas.microsoft.com/office/word/2010/wordprocessingDrawing" xmlns:wp="http://schemas.openxmlformats.org/drawingml/2006/wordprocessingDrawing" xmlns:w10="urn:schemas-microsoft-com:office:word" xmlns:w="http://schemas.openxmlformats.org/wordprocessingml/2006/main" xmlns:w14="http://schemas.microsoft.com/office/word/2010/wordml" xmlns:w15="http://schemas.microsoft.com/office/word/2012/wordml" xmlns:w16cei="http://schemas.microsoft.com/office/word/2026/wordml/cei" xmlns:w16cex="http://schemas.microsoft.com/office/word/2018/wordml/cex" xmlns:w16cid="http://schemas.microsoft.com/office/word/2016/wordml/cid" xmlns:w16="http://schemas.microsoft.com/office/word/2018/wordml" xmlns:w16du="http://schemas.microsoft.com/office/word/2023/wordml/word16du" xmlns:w16sdtdh="http://schemas.microsoft.com/office/word/2020/wordml/sdtdatahash" xmlns:w16sdtfl="http://schemas.microsoft.com/office/word/2024/wordml/sdtformatlock" xmlns:w16se="http://schemas.microsoft.com/office/word/2015/wordml/symex" xmlns:wpg="http://schemas.microsoft.com/office/word/2010/wordprocessingGroup" xmlns:wpi="http://schemas.microsoft.com/office/word/2010/wordprocessingInk" xmlns:wne="http://schemas.microsoft.com/office/word/2006/wordml" xmlns:wps="http://schemas.microsoft.com/office/word/2010/wordprocessingShape" mc:Ignorable="w14 w15 w16se w16cid w16 w16cex w16sdtdh w16sdtfl w16du wp14">
+<w:hdr xmlns:wpc="http://schemas.microsoft.com/office/word/2010/wordprocessingCanvas" xmlns:cx="http://schemas.microsoft.com/office/drawing/2014/chartex" xmlns:cx1="http://schemas.microsoft.com/office/drawing/2015/9/8/chartex" xmlns:cx2="http://schemas.microsoft.com/office/drawing/2015/10/21/chartex" xmlns:cx3="http://schemas.microsoft.com/office/drawing/2016/5/9/chartex" xmlns:cx4="http://schemas.microsoft.com/office/drawing/2016/5/10/chartex" xmlns:cx5="http://schemas.microsoft.com/office/drawing/2016/5/11/chartex" xmlns:cx6="http://schemas.microsoft.com/office/drawing/2016/5/12/chartex" xmlns:cx7="http://schemas.microsoft.com/office/drawing/2016/5/13/chartex" xmlns:cx8="http://schemas.microsoft.com/office/drawing/2016/5/14/chartex" xmlns:mc="http://schemas.openxmlformats.org/markup-compatibility/2006" xmlns:aink="http://schemas.microsoft.com/office/drawing/2016/ink" xmlns:am3d="http://schemas.microsoft.com/office/drawing/2017/model3d" xmlns:o="urn:schemas-microsoft-com:office:office" xmlns:oel="http://schemas.microsoft.com/office/2019/extlst" xmlns:r="http://schemas.openxmlformats.org/officeDocument/2006/relationships" xmlns:m="http://schemas.openxmlformats.org/officeDocument/2006/math" xmlns:v="urn:schemas-microsoft-com:vml" xmlns:wp14="http://schemas.microsoft.com/office/word/2010/wordprocessingDrawing" xmlns:wp="http://schemas.openxmlformats.org/drawingml/2006/wordprocessingDrawing" xmlns:w10="urn:schemas-microsoft-com:office:word" xmlns:w="http://schemas.openxmlformats.org/wordprocessingml/2006/main" xmlns:w14="http://schemas.microsoft.com/office/word/2010/wordml" xmlns:w15="http://schemas.microsoft.com/office/word/2012/wordml" xmlns:w16cex="http://schemas.microsoft.com/office/word/2018/wordml/cex" xmlns:w16cid="http://schemas.microsoft.com/office/word/2016/wordml/cid" xmlns:w16="http://schemas.microsoft.com/office/word/2018/wordml" xmlns:w16du="http://schemas.microsoft.com/office/word/2023/wordml/word16du" xmlns:w16sdtdh="http://schemas.microsoft.com/office/word/2020/wordml/sdtdatahash" xmlns:w16sdtfl="http://schemas.microsoft.com/office/word/2024/wordml/sdtformatlock" xmlns:w16se="http://schemas.microsoft.com/office/word/2015/wordml/symex" xmlns:wpg="http://schemas.microsoft.com/office/word/2010/wordprocessingGroup" xmlns:wpi="http://schemas.microsoft.com/office/word/2010/wordprocessingInk" xmlns:wne="http://schemas.microsoft.com/office/word/2006/wordml" xmlns:wps="http://schemas.microsoft.com/office/word/2010/wordprocessingShape" mc:Ignorable="w14 w15 w16se w16cid w16 w16cex w16sdtdh w16sdtfl w16du wp14">
   <w:p>
     <w:pPr>
       <w:pStyle w:val="Header"/>
@@ -3127,7 +3109,7 @@
 </file>
 
 <file path=word/header3.xml><?xml version="1.0" encoding="utf-8"?>
-<w:hdr xmlns:wpc="http://schemas.microsoft.com/office/word/2010/wordprocessingCanvas" xmlns:cx="http://schemas.microsoft.com/office/drawing/2014/chartex" xmlns:cx1="http://schemas.microsoft.com/office/drawing/2015/9/8/chartex" xmlns:cx2="http://schemas.microsoft.com/office/drawing/2015/10/21/chartex" xmlns:cx3="http://schemas.microsoft.com/office/drawing/2016/5/9/chartex" xmlns:cx4="http://schemas.microsoft.com/office/drawing/2016/5/10/chartex" xmlns:cx5="http://schemas.microsoft.com/office/drawing/2016/5/11/chartex" xmlns:cx6="http://schemas.microsoft.com/office/drawing/2016/5/12/chartex" xmlns:cx7="http://schemas.microsoft.com/office/drawing/2016/5/13/chartex" xmlns:cx8="http://schemas.microsoft.com/office/drawing/2016/5/14/chartex" xmlns:mc="http://schemas.openxmlformats.org/markup-compatibility/2006" xmlns:aink="http://schemas.microsoft.com/office/drawing/2016/ink" xmlns:am3d="http://schemas.microsoft.com/office/drawing/2017/model3d" xmlns:o="urn:schemas-microsoft-com:office:office" xmlns:oel="http://schemas.microsoft.com/office/2019/extlst" xmlns:r="http://schemas.openxmlformats.org/officeDocument/2006/relationships" xmlns:m="http://schemas.openxmlformats.org/officeDocument/2006/math" xmlns:v="urn:schemas-microsoft-com:vml" xmlns:wp14="http://schemas.microsoft.com/office/word/2010/wordprocessingDrawing" xmlns:wp="http://schemas.openxmlformats.org/drawingml/2006/wordprocessingDrawing" xmlns:w10="urn:schemas-microsoft-com:office:word" xmlns:w="http://schemas.openxmlformats.org/wordprocessingml/2006/main" xmlns:w14="http://schemas.microsoft.com/office/word/2010/wordml" xmlns:w15="http://schemas.microsoft.com/office/word/2012/wordml" xmlns:w16cei="http://schemas.microsoft.com/office/word/2026/wordml/cei" xmlns:w16cex="http://schemas.microsoft.com/office/word/2018/wordml/cex" xmlns:w16cid="http://schemas.microsoft.com/office/word/2016/wordml/cid" xmlns:w16="http://schemas.microsoft.com/office/word/2018/wordml" xmlns:w16du="http://schemas.microsoft.com/office/word/2023/wordml/word16du" xmlns:w16sdtdh="http://schemas.microsoft.com/office/word/2020/wordml/sdtdatahash" xmlns:w16sdtfl="http://schemas.microsoft.com/office/word/2024/wordml/sdtformatlock" xmlns:w16se="http://schemas.microsoft.com/office/word/2015/wordml/symex" xmlns:wpg="http://schemas.microsoft.com/office/word/2010/wordprocessingGroup" xmlns:wpi="http://schemas.microsoft.com/office/word/2010/wordprocessingInk" xmlns:wne="http://schemas.microsoft.com/office/word/2006/wordml" xmlns:wps="http://schemas.microsoft.com/office/word/2010/wordprocessingShape" mc:Ignorable="w14 w15 w16se w16cid w16 w16cex w16sdtdh w16sdtfl w16du wp14">
+<w:hdr xmlns:wpc="http://schemas.microsoft.com/office/word/2010/wordprocessingCanvas" xmlns:cx="http://schemas.microsoft.com/office/drawing/2014/chartex" xmlns:cx1="http://schemas.microsoft.com/office/drawing/2015/9/8/chartex" xmlns:cx2="http://schemas.microsoft.com/office/drawing/2015/10/21/chartex" xmlns:cx3="http://schemas.microsoft.com/office/drawing/2016/5/9/chartex" xmlns:cx4="http://schemas.microsoft.com/office/drawing/2016/5/10/chartex" xmlns:cx5="http://schemas.microsoft.com/office/drawing/2016/5/11/chartex" xmlns:cx6="http://schemas.microsoft.com/office/drawing/2016/5/12/chartex" xmlns:cx7="http://schemas.microsoft.com/office/drawing/2016/5/13/chartex" xmlns:cx8="http://schemas.microsoft.com/office/drawing/2016/5/14/chartex" xmlns:mc="http://schemas.openxmlformats.org/markup-compatibility/2006" xmlns:aink="http://schemas.microsoft.com/office/drawing/2016/ink" xmlns:am3d="http://schemas.microsoft.com/office/drawing/2017/model3d" xmlns:o="urn:schemas-microsoft-com:office:office" xmlns:oel="http://schemas.microsoft.com/office/2019/extlst" xmlns:r="http://schemas.openxmlformats.org/officeDocument/2006/relationships" xmlns:m="http://schemas.openxmlformats.org/officeDocument/2006/math" xmlns:v="urn:schemas-microsoft-com:vml" xmlns:wp14="http://schemas.microsoft.com/office/word/2010/wordprocessingDrawing" xmlns:wp="http://schemas.openxmlformats.org/drawingml/2006/wordprocessingDrawing" xmlns:w10="urn:schemas-microsoft-com:office:word" xmlns:w="http://schemas.openxmlformats.org/wordprocessingml/2006/main" xmlns:w14="http://schemas.microsoft.com/office/word/2010/wordml" xmlns:w15="http://schemas.microsoft.com/office/word/2012/wordml" xmlns:w16cex="http://schemas.microsoft.com/office/word/2018/wordml/cex" xmlns:w16cid="http://schemas.microsoft.com/office/word/2016/wordml/cid" xmlns:w16="http://schemas.microsoft.com/office/word/2018/wordml" xmlns:w16du="http://schemas.microsoft.com/office/word/2023/wordml/word16du" xmlns:w16sdtdh="http://schemas.microsoft.com/office/word/2020/wordml/sdtdatahash" xmlns:w16sdtfl="http://schemas.microsoft.com/office/word/2024/wordml/sdtformatlock" xmlns:w16se="http://schemas.microsoft.com/office/word/2015/wordml/symex" xmlns:wpg="http://schemas.microsoft.com/office/word/2010/wordprocessingGroup" xmlns:wpi="http://schemas.microsoft.com/office/word/2010/wordprocessingInk" xmlns:wne="http://schemas.microsoft.com/office/word/2006/wordml" xmlns:wps="http://schemas.microsoft.com/office/word/2010/wordprocessingShape" mc:Ignorable="w14 w15 w16se w16cid w16 w16cex w16sdtdh w16sdtfl w16du wp14">
   <w:p>
     <w:pPr>
       <w:pStyle w:val="Header"/>
@@ -3137,7 +3119,7 @@
 </file>
 
 <file path=word/numbering.xml><?xml version="1.0" encoding="utf-8"?>
-<w:numbering xmlns:wpc="http://schemas.microsoft.com/office/word/2010/wordprocessingCanvas" xmlns:cx="http://schemas.microsoft.com/office/drawing/2014/chartex" xmlns:cx1="http://schemas.microsoft.com/office/drawing/2015/9/8/chartex" xmlns:cx2="http://schemas.microsoft.com/office/drawing/2015/10/21/chartex" xmlns:cx3="http://schemas.microsoft.com/office/drawing/2016/5/9/chartex" xmlns:cx4="http://schemas.microsoft.com/office/drawing/2016/5/10/chartex" xmlns:cx5="http://schemas.microsoft.com/office/drawing/2016/5/11/chartex" xmlns:cx6="http://schemas.microsoft.com/office/drawing/2016/5/12/chartex" xmlns:cx7="http://schemas.microsoft.com/office/drawing/2016/5/13/chartex" xmlns:cx8="http://schemas.microsoft.com/office/drawing/2016/5/14/chartex" xmlns:mc="http://schemas.openxmlformats.org/markup-compatibility/2006" xmlns:aink="http://schemas.microsoft.com/office/drawing/2016/ink" xmlns:am3d="http://schemas.microsoft.com/office/drawing/2017/model3d" xmlns:o="urn:schemas-microsoft-com:office:office" xmlns:oel="http://schemas.microsoft.com/office/2019/extlst" xmlns:r="http://schemas.openxmlformats.org/officeDocument/2006/relationships" xmlns:m="http://schemas.openxmlformats.org/officeDocument/2006/math" xmlns:v="urn:schemas-microsoft-com:vml" xmlns:wp14="http://schemas.microsoft.com/office/word/2010/wordprocessingDrawing" xmlns:wp="http://schemas.openxmlformats.org/drawingml/2006/wordprocessingDrawing" xmlns:w10="urn:schemas-microsoft-com:office:word" xmlns:w="http://schemas.openxmlformats.org/wordprocessingml/2006/main" xmlns:w14="http://schemas.microsoft.com/office/word/2010/wordml" xmlns:w15="http://schemas.microsoft.com/office/word/2012/wordml" xmlns:w16cei="http://schemas.microsoft.com/office/word/2026/wordml/cei" xmlns:w16cex="http://schemas.microsoft.com/office/word/2018/wordml/cex" xmlns:w16cid="http://schemas.microsoft.com/office/word/2016/wordml/cid" xmlns:w16="http://schemas.microsoft.com/office/word/2018/wordml" xmlns:w16du="http://schemas.microsoft.com/office/word/2023/wordml/word16du" xmlns:w16sdtdh="http://schemas.microsoft.com/office/word/2020/wordml/sdtdatahash" xmlns:w16sdtfl="http://schemas.microsoft.com/office/word/2024/wordml/sdtformatlock" xmlns:w16se="http://schemas.microsoft.com/office/word/2015/wordml/symex" xmlns:wpg="http://schemas.microsoft.com/office/word/2010/wordprocessingGroup" xmlns:wpi="http://schemas.microsoft.com/office/word/2010/wordprocessingInk" xmlns:wne="http://schemas.microsoft.com/office/word/2006/wordml" xmlns:wps="http://schemas.microsoft.com/office/word/2010/wordprocessingShape" mc:Ignorable="w14 w15 w16se w16cid w16 w16cex w16sdtdh w16sdtfl w16du wp14">
+<w:numbering xmlns:wpc="http://schemas.microsoft.com/office/word/2010/wordprocessingCanvas" xmlns:cx="http://schemas.microsoft.com/office/drawing/2014/chartex" xmlns:cx1="http://schemas.microsoft.com/office/drawing/2015/9/8/chartex" xmlns:cx2="http://schemas.microsoft.com/office/drawing/2015/10/21/chartex" xmlns:cx3="http://schemas.microsoft.com/office/drawing/2016/5/9/chartex" xmlns:cx4="http://schemas.microsoft.com/office/drawing/2016/5/10/chartex" xmlns:cx5="http://schemas.microsoft.com/office/drawing/2016/5/11/chartex" xmlns:cx6="http://schemas.microsoft.com/office/drawing/2016/5/12/chartex" xmlns:cx7="http://schemas.microsoft.com/office/drawing/2016/5/13/chartex" xmlns:cx8="http://schemas.microsoft.com/office/drawing/2016/5/14/chartex" xmlns:mc="http://schemas.openxmlformats.org/markup-compatibility/2006" xmlns:aink="http://schemas.microsoft.com/office/drawing/2016/ink" xmlns:am3d="http://schemas.microsoft.com/office/drawing/2017/model3d" xmlns:o="urn:schemas-microsoft-com:office:office" xmlns:oel="http://schemas.microsoft.com/office/2019/extlst" xmlns:r="http://schemas.openxmlformats.org/officeDocument/2006/relationships" xmlns:m="http://schemas.openxmlformats.org/officeDocument/2006/math" xmlns:v="urn:schemas-microsoft-com:vml" xmlns:wp14="http://schemas.microsoft.com/office/word/2010/wordprocessingDrawing" xmlns:wp="http://schemas.openxmlformats.org/drawingml/2006/wordprocessingDrawing" xmlns:w10="urn:schemas-microsoft-com:office:word" xmlns:w="http://schemas.openxmlformats.org/wordprocessingml/2006/main" xmlns:w14="http://schemas.microsoft.com/office/word/2010/wordml" xmlns:w15="http://schemas.microsoft.com/office/word/2012/wordml" xmlns:w16cex="http://schemas.microsoft.com/office/word/2018/wordml/cex" xmlns:w16cid="http://schemas.microsoft.com/office/word/2016/wordml/cid" xmlns:w16="http://schemas.microsoft.com/office/word/2018/wordml" xmlns:w16du="http://schemas.microsoft.com/office/word/2023/wordml/word16du" xmlns:w16sdtdh="http://schemas.microsoft.com/office/word/2020/wordml/sdtdatahash" xmlns:w16sdtfl="http://schemas.microsoft.com/office/word/2024/wordml/sdtformatlock" xmlns:w16se="http://schemas.microsoft.com/office/word/2015/wordml/symex" xmlns:wpg="http://schemas.microsoft.com/office/word/2010/wordprocessingGroup" xmlns:wpi="http://schemas.microsoft.com/office/word/2010/wordprocessingInk" xmlns:wne="http://schemas.microsoft.com/office/word/2006/wordml" xmlns:wps="http://schemas.microsoft.com/office/word/2010/wordprocessingShape" mc:Ignorable="w14 w15 w16se w16cid w16 w16cex w16sdtdh w16sdtfl w16du wp14">
   <w:abstractNum w:abstractNumId="0" w15:restartNumberingAfterBreak="0">
     <w:nsid w:val="01164B5E"/>
     <w:multiLevelType w:val="hybridMultilevel"/>

</xml_diff>

<commit_message>
Mixer and Boolean updates
Bumps Qsys SIMPL/Module assets from v4.7.0 to v4.8.0, including renamed/moved module files, refreshed binary artifacts, and updated core help documentation. Adds control logic enhancements in USP modules: boolean controls now use explicit true/false with a new momentary press input, and matrix mixer crosspoint/input/output faders gain mute toggle support plus hold-before-repeat gain ramping.
</commit_message>
<xml_diff>
--- a/SIMPL/Qsys Core Help File.docx
+++ b/SIMPL/Qsys Core Help File.docx
@@ -260,7 +260,16 @@
                 <w:sz w:val="15"/>
                 <w:szCs w:val="24"/>
               </w:rPr>
-              <w:t>7.0</w:t>
+              <w:t>8</w:t>
+            </w:r>
+            <w:r>
+              <w:rPr>
+                <w:rFonts w:ascii="Verdana" w:hAnsi="Verdana"/>
+                <w:color w:val="000000"/>
+                <w:sz w:val="15"/>
+                <w:szCs w:val="24"/>
+              </w:rPr>
+              <w:t>.0</w:t>
             </w:r>
           </w:p>
         </w:tc>

</xml_diff>